<commit_message>
made changes for document
</commit_message>
<xml_diff>
--- a/Backend/docx_templates/PBI Report Validation - Template.docx
+++ b/Backend/docx_templates/PBI Report Validation - Template.docx
@@ -465,8 +465,8 @@
             <w:sdt>
               <w:sdtPr>
                 <w:alias w:val="Resource Name"/>
-                <w:id w:val="1155161231"/>
-                <w:dropDownList w:lastValue="Arun Kumar Talupuri">
+                <w:id w:val="1792845620"/>
+                <w:dropDownList w:lastValue="Jagruthi Manchi Saraf">
                   <w:listItem w:displayText="Arun Kumar Talupuri" w:value="Arun Kumar Talupuri"/>
                   <w:listItem w:displayText="Jagruthi Manchi Saraf" w:value="Jagruthi Manchi Saraf"/>
                   <w:listItem w:displayText="Madhu Babu Mushtina" w:value="Madhu Babu Mushtina"/>
@@ -484,7 +484,7 @@
                     <w:color w:val="000000"/>
                     <w:shd w:fill="e8eaed" w:val="clear"/>
                   </w:rPr>
-                  <w:t xml:space="preserve">Arun Kumar Talupuri</w:t>
+                  <w:t xml:space="preserve">Jagruthi Manchi Saraf</w:t>
                 </w:r>
               </w:sdtContent>
             </w:sdt>
@@ -639,7 +639,7 @@
             <w:sdt>
               <w:sdtPr>
                 <w:alias w:val="Status"/>
-                <w:id w:val="1898734082"/>
+                <w:id w:val="704871532"/>
                 <w:dropDownList w:lastValue="Pass✅">
                   <w:listItem w:displayText="Pass✅" w:value="Pass✅"/>
                   <w:listItem w:displayText="Fail❌" w:value="Fail❌"/>
@@ -1031,7 +1031,7 @@
             <w:sdt>
               <w:sdtPr>
                 <w:alias w:val="Refresh Status"/>
-                <w:id w:val="-344380629"/>
+                <w:id w:val="-1538243179"/>
                 <w:dropDownList w:lastValue="Success✅">
                   <w:listItem w:displayText="Success✅" w:value="Success✅"/>
                   <w:listItem w:displayText="Failed❌" w:value="Failed❌"/>
@@ -1088,7 +1088,7 @@
             <w:sdt>
               <w:sdtPr>
                 <w:alias w:val="Refresh Status"/>
-                <w:id w:val="255567452"/>
+                <w:id w:val="-938295098"/>
                 <w:dropDownList w:lastValue="Success✅">
                   <w:listItem w:displayText="Success✅" w:value="Success✅"/>
                   <w:listItem w:displayText="Failed❌" w:value="Failed❌"/>
@@ -1191,7 +1191,7 @@
             <w:sdt>
               <w:sdtPr>
                 <w:alias w:val="Yes / No"/>
-                <w:id w:val="1001112229"/>
+                <w:id w:val="-192750321"/>
                 <w:dropDownList w:lastValue="Yes ✅">
                   <w:listItem w:displayText="Yes ✅" w:value="Yes ✅"/>
                   <w:listItem w:displayText="No ❌" w:value="No ❌"/>
@@ -1248,7 +1248,7 @@
             <w:sdt>
               <w:sdtPr>
                 <w:alias w:val="Yes / No"/>
-                <w:id w:val="-746891982"/>
+                <w:id w:val="-1940754532"/>
                 <w:dropDownList w:lastValue="Yes ✅">
                   <w:listItem w:displayText="Yes ✅" w:value="Yes ✅"/>
                   <w:listItem w:displayText="No ❌" w:value="No ❌"/>
@@ -1351,7 +1351,7 @@
             <w:sdt>
               <w:sdtPr>
                 <w:alias w:val="Pass / Fail"/>
-                <w:id w:val="1125088251"/>
+                <w:id w:val="-68774299"/>
                 <w:dropDownList w:lastValue="Pass✅">
                   <w:listItem w:displayText="Pass✅" w:value="Pass✅"/>
                   <w:listItem w:displayText="Fail❌" w:value="Fail❌"/>
@@ -1419,7 +1419,7 @@
             <w:sdt>
               <w:sdtPr>
                 <w:alias w:val="Pass / Fail"/>
-                <w:id w:val="251108710"/>
+                <w:id w:val="-942753840"/>
                 <w:dropDownList w:lastValue="Pass✅">
                   <w:listItem w:displayText="Pass✅" w:value="Pass✅"/>
                   <w:listItem w:displayText="Fail❌" w:value="Fail❌"/>
@@ -2219,7 +2219,7 @@
             <w:sdt>
               <w:sdtPr>
                 <w:alias w:val="Pass / Fail"/>
-                <w:id w:val="1566876127"/>
+                <w:id w:val="373013577"/>
                 <w:dropDownList w:lastValue="Pass✅">
                   <w:listItem w:displayText="Pass✅" w:value="Pass✅"/>
                   <w:listItem w:displayText="Fail❌" w:value="Fail❌"/>
@@ -2420,7 +2420,7 @@
             <w:sdt>
               <w:sdtPr>
                 <w:alias w:val="Pass / Fail"/>
-                <w:id w:val="-177372449"/>
+                <w:id w:val="-1371234999"/>
                 <w:dropDownList w:lastValue="Pass✅">
                   <w:listItem w:displayText="Pass✅" w:value="Pass✅"/>
                   <w:listItem w:displayText="Fail❌" w:value="Fail❌"/>
@@ -2621,7 +2621,7 @@
             <w:sdt>
               <w:sdtPr>
                 <w:alias w:val="Pass / Fail"/>
-                <w:id w:val="758297345"/>
+                <w:id w:val="-435565205"/>
                 <w:dropDownList w:lastValue="Pass✅">
                   <w:listItem w:displayText="Pass✅" w:value="Pass✅"/>
                   <w:listItem w:displayText="Fail❌" w:value="Fail❌"/>
@@ -3487,7 +3487,7 @@
             <w:sdt>
               <w:sdtPr>
                 <w:alias w:val="Pass / Fail"/>
-                <w:id w:val="-528332982"/>
+                <w:id w:val="-1722195532"/>
                 <w:dropDownList w:lastValue="Pass✅">
                   <w:listItem w:displayText="Pass✅" w:value="Pass✅"/>
                   <w:listItem w:displayText="Fail❌" w:value="Fail❌"/>
@@ -3717,7 +3717,7 @@
             <w:sdt>
               <w:sdtPr>
                 <w:alias w:val="Pass / Fail"/>
-                <w:id w:val="1802688455"/>
+                <w:id w:val="608825905"/>
                 <w:dropDownList w:lastValue="Pass✅">
                   <w:listItem w:displayText="Pass✅" w:value="Pass✅"/>
                   <w:listItem w:displayText="Fail❌" w:value="Fail❌"/>
@@ -3947,7 +3947,7 @@
             <w:sdt>
               <w:sdtPr>
                 <w:alias w:val="Pass / Fail"/>
-                <w:id w:val="1427722121"/>
+                <w:id w:val="233859571"/>
                 <w:dropDownList w:lastValue="Pass✅">
                   <w:listItem w:displayText="Pass✅" w:value="Pass✅"/>
                   <w:listItem w:displayText="Fail❌" w:value="Fail❌"/>
@@ -4617,7 +4617,7 @@
             <w:sdt>
               <w:sdtPr>
                 <w:alias w:val="Pass / Fail"/>
-                <w:id w:val="-1619187456"/>
+                <w:id w:val="1481917290"/>
                 <w:dropDownList w:lastValue="Pass✅">
                   <w:listItem w:displayText="Pass✅" w:value="Pass✅"/>
                   <w:listItem w:displayText="Fail❌" w:value="Fail❌"/>
@@ -4854,7 +4854,7 @@
             <w:sdt>
               <w:sdtPr>
                 <w:alias w:val="Pass / Fail"/>
-                <w:id w:val="-1643559858"/>
+                <w:id w:val="1457544888"/>
                 <w:dropDownList w:lastValue="Pass✅">
                   <w:listItem w:displayText="Pass✅" w:value="Pass✅"/>
                   <w:listItem w:displayText="Fail❌" w:value="Fail❌"/>
@@ -5079,7 +5079,7 @@
             <w:sdt>
               <w:sdtPr>
                 <w:alias w:val="Pass / Fail"/>
-                <w:id w:val="-103127662"/>
+                <w:id w:val="-1296990212"/>
                 <w:dropDownList w:lastValue="Pass✅">
                   <w:listItem w:displayText="Pass✅" w:value="Pass✅"/>
                   <w:listItem w:displayText="Fail❌" w:value="Fail❌"/>
@@ -5304,7 +5304,7 @@
             <w:sdt>
               <w:sdtPr>
                 <w:alias w:val="Pass / Fail"/>
-                <w:id w:val="-1344408076"/>
+                <w:id w:val="1756696670"/>
                 <w:dropDownList w:lastValue="Pass✅">
                   <w:listItem w:displayText="Pass✅" w:value="Pass✅"/>
                   <w:listItem w:displayText="Fail❌" w:value="Fail❌"/>
@@ -5547,7 +5547,7 @@
             <w:sdt>
               <w:sdtPr>
                 <w:alias w:val="Pass / Fail"/>
-                <w:id w:val="124386581"/>
+                <w:id w:val="-1069475969"/>
                 <w:dropDownList w:lastValue="Pass✅">
                   <w:listItem w:displayText="Pass✅" w:value="Pass✅"/>
                   <w:listItem w:displayText="Fail❌" w:value="Fail❌"/>
@@ -5650,7 +5650,7 @@
             <w:sdt>
               <w:sdtPr>
                 <w:alias w:val="Resource Name"/>
-                <w:id w:val="1750873599"/>
+                <w:id w:val="557011049"/>
                 <w:dropDownList w:lastValue="Arun Kumar Talupuri">
                   <w:listItem w:displayText="Arun Kumar Talupuri" w:value="Arun Kumar Talupuri"/>
                   <w:listItem w:displayText="Jagruthi Manchi Saraf" w:value="Jagruthi Manchi Saraf"/>
@@ -5821,12 +5821,12 @@
         <wp:inline distB="114300" distT="114300" distL="114300" distR="114300">
           <wp:extent cx="957263" cy="371032"/>
           <wp:effectExtent b="0" l="0" r="0" t="0"/>
-          <wp:docPr id="1" name="image1.png"/>
+          <wp:docPr id="1" name="image2.png"/>
           <a:graphic>
             <a:graphicData uri="http://schemas.openxmlformats.org/drawingml/2006/picture">
               <pic:pic>
                 <pic:nvPicPr>
-                  <pic:cNvPr id="0" name="image1.png"/>
+                  <pic:cNvPr id="0" name="image2.png"/>
                   <pic:cNvPicPr preferRelativeResize="0"/>
                 </pic:nvPicPr>
                 <pic:blipFill>
@@ -5862,12 +5862,12 @@
         <wp:inline distB="114300" distT="114300" distL="114300" distR="114300">
           <wp:extent cx="1349999" cy="370427"/>
           <wp:effectExtent b="0" l="0" r="0" t="0"/>
-          <wp:docPr id="2" name="image2.png"/>
+          <wp:docPr id="2" name="image1.png"/>
           <a:graphic>
             <a:graphicData uri="http://schemas.openxmlformats.org/drawingml/2006/picture">
               <pic:pic>
                 <pic:nvPicPr>
-                  <pic:cNvPr id="0" name="image2.png"/>
+                  <pic:cNvPr id="0" name="image1.png"/>
                   <pic:cNvPicPr preferRelativeResize="0"/>
                 </pic:nvPicPr>
                 <pic:blipFill>

</xml_diff>